<commit_message>
Demo Related Changes Pushed
</commit_message>
<xml_diff>
--- a/SCNXTHack/GreenGate/data/ABC_Green_Infrastructure_Annual_Report_2025.docx
+++ b/SCNXTHack/GreenGate/data/ABC_Green_Infrastructure_Annual_Report_2025.docx
@@ -4,49 +4,25 @@
   <w:body>
     <w:p>
       <w:pPr>
-        <w:pStyle w:val="Heading1"/>
+        <w:pStyle w:val="Title"/>
       </w:pPr>
       <w:r>
-        <w:t>Mock Annual Report 2025</w:t>
+        <w:t>Annual Report 2025</w:t>
       </w:r>
     </w:p>
     <w:p>
       <w:r>
-        <w:rPr>
-          <w:b/>
-        </w:rPr>
-        <w:t xml:space="preserve">Company: </w:t>
-      </w:r>
-      <w:r>
-        <w:t>ABC Green Infrastructure Ltd.</w:t>
-      </w:r>
-      <w:r>
-        <w:rPr>
-          <w:b/>
-        </w:rPr>
-        <w:br/>
-        <w:t xml:space="preserve">Document: </w:t>
-      </w:r>
-      <w:r>
-        <w:t>Annual Report</w:t>
-      </w:r>
-      <w:r>
-        <w:rPr>
-          <w:b/>
-        </w:rPr>
-        <w:br/>
-        <w:t xml:space="preserve">Reporting Year: </w:t>
-      </w:r>
-      <w:r>
-        <w:t>FY2025</w:t>
+        <w:t>Company: ABC Green Infrastructure Ltd.</w:t>
       </w:r>
     </w:p>
     <w:p>
-      <w:pPr>
-        <w:pStyle w:val="Heading2"/>
-      </w:pPr>
       <w:r>
-        <w:t>Executive Summary</w:t>
+        <w:t>Document: Annual Report</w:t>
+      </w:r>
+    </w:p>
+    <w:p>
+      <w:r>
+        <w:t>Reporting Year: FY2025</w:t>
       </w:r>
     </w:p>
     <w:p>
@@ -56,7 +32,7 @@
     </w:p>
     <w:p>
       <w:pPr>
-        <w:pStyle w:val="Heading2"/>
+        <w:pStyle w:val="Heading1"/>
       </w:pPr>
       <w:r>
         <w:t>Business Overview</w:t>
@@ -64,12 +40,12 @@
     </w:p>
     <w:p>
       <w:r>
-        <w:t>ABC Green Infrastructure Ltd. develops sustainable transport corridors, commercial buildings and renewable-ready industrial parks.</w:t>
+        <w:t>ABC Green Infrastructure Ltd. develops sustainable transport corridors, commercial buildings and renewable-ready industrial parks across India, with an order book of INR 34,600 Cr as of March 2025.</w:t>
       </w:r>
     </w:p>
     <w:p>
       <w:pPr>
-        <w:pStyle w:val="Heading2"/>
+        <w:pStyle w:val="Heading1"/>
       </w:pPr>
       <w:r>
         <w:t>Corporate Governance</w:t>
@@ -77,12 +53,12 @@
     </w:p>
     <w:p>
       <w:r>
-        <w:t>Board consists of 9 directors, including 6 independent directors. Audit, Risk and ESG Committees are active.</w:t>
+        <w:t>The Board comprises 9 directors, including 6 independent directors, representing a two-thirds independent majority. The Audit Committee, Risk Committee and ESG Committee are each chaired by an independent director and meet quarterly.</w:t>
       </w:r>
     </w:p>
     <w:p>
       <w:pPr>
-        <w:pStyle w:val="Heading2"/>
+        <w:pStyle w:val="Heading1"/>
       </w:pPr>
       <w:r>
         <w:t>Risk Management</w:t>
@@ -90,12 +66,12 @@
     </w:p>
     <w:p>
       <w:r>
-        <w:t>Climate risk is included in enterprise risk management. Scenario analysis is performed annually.</w:t>
+        <w:t>Climate risk, including transition and physical risk categories, is formally integrated into the enterprise risk management (ERM) framework. Scenario analysis under 1.5C and 4C pathways is performed annually and reported to the Risk Committee.</w:t>
       </w:r>
     </w:p>
     <w:p>
       <w:pPr>
-        <w:pStyle w:val="Heading2"/>
+        <w:pStyle w:val="Heading1"/>
       </w:pPr>
       <w:r>
         <w:t>Financial Highlights</w:t>
@@ -103,12 +79,12 @@
     </w:p>
     <w:p>
       <w:r>
-        <w:t>Revenue: INR 12,450 Cr. Profit After Tax: INR 1,180 Cr. Debt-to-Equity: 0.62.</w:t>
+        <w:t>Revenue: INR 12,450 Cr. Profit After Tax: INR 1,180 Cr. Debt-to-Equity: 0.62. Return on Capital Employed: 14.2%.</w:t>
       </w:r>
     </w:p>
     <w:p>
       <w:pPr>
-        <w:pStyle w:val="Heading2"/>
+        <w:pStyle w:val="Heading1"/>
       </w:pPr>
       <w:r>
         <w:t>Future Outlook</w:t>
@@ -116,7 +92,7 @@
     </w:p>
     <w:p>
       <w:r>
-        <w:t>Pipeline includes resilient infrastructure and green-certified developments.</w:t>
+        <w:t>The project pipeline for FY2026 includes resilient infrastructure and green-certified developments, with continued investment in climate adaptation engineering standards.</w:t>
       </w:r>
     </w:p>
     <w:sectPr>
@@ -492,9 +468,6 @@
     <w:name w:val="Normal"/>
     <w:qFormat/>
     <w:rsid w:val="00FC693F"/>
-    <w:rPr>
-      <w:sz w:val="22"/>
-    </w:rPr>
   </w:style>
   <w:style w:type="paragraph" w:styleId="Header">
     <w:name w:val="header"/>

</xml_diff>